<commit_message>
fix: pass rewrite source text to dify chat
</commit_message>
<xml_diff>
--- a/docs/operations/AI-WPS-Dify多任务工作流节点配置手册-v0.10.0.docx
+++ b/docs/operations/AI-WPS-Dify多任务工作流节点配置手册-v0.10.0.docx
@@ -1450,14 +1450,8 @@
             <w:vAlign w:val="top"/>
           </w:tcPr>
           <w:p>
-            <w:r/>
             <w:r>
-              <w:rPr>
-                <w:rFonts w:ascii="微软雅黑" w:hAnsi="微软雅黑" w:eastAsia="微软雅黑"/>
-                <w:b w:val="0"/>
-                <w:sz w:val="18"/>
-              </w:rPr>
-              <w:t>inputs.source_text</w:t>
+              <w:t>inputs.source_text / inputs.text</w:t>
             </w:r>
           </w:p>
         </w:tc>
@@ -1785,14 +1779,8 @@
             <w:vAlign w:val="top"/>
           </w:tcPr>
           <w:p>
-            <w:r/>
             <w:r>
-              <w:rPr>
-                <w:rFonts w:ascii="微软雅黑" w:hAnsi="微软雅黑" w:eastAsia="微软雅黑"/>
-                <w:b w:val="0"/>
-                <w:sz w:val="18"/>
-              </w:rPr>
-              <w:t>接收 query 和 inputs.source_text</w:t>
+              <w:t>接收 query 和 inputs.source_text / inputs.text</w:t>
             </w:r>
           </w:p>
         </w:tc>
@@ -5298,6 +5286,32 @@
       </w:tr>
     </w:tbl>
     <w:p/>
+    <w:p>
+      <w:pPr>
+        <w:pStyle w:val="Heading1"/>
+      </w:pPr>
+      <w:r>
+        <w:t>14. 改写/续写 Chat 模式字段说明</w:t>
+      </w:r>
+    </w:p>
+    <w:p>
+      <w:r>
+        <w:rPr>
+          <w:b/>
+        </w:rPr>
+        <w:t>从 v0.10.0-alpha 后续修正版开始，智能改写和智能续写会把待处理原文同时放入 query、inputs.source_text 和 inputs.text。</w:t>
+      </w:r>
+    </w:p>
+    <w:p>
+      <w:r>
+        <w:t>Dify Chat App 如果直接使用用户消息，读取 query 即可；如果在提示词中使用变量，建议读取 inputs.source_text 或 inputs.text。</w:t>
+      </w:r>
+    </w:p>
+    <w:p>
+      <w:r>
+        <w:t>建议 LLM 节点输出 answer，且只输出最终改写/续写正文，不要返回解释或原文。</w:t>
+      </w:r>
+    </w:p>
     <w:sectPr>
       <w:pgSz w:w="12240" w:h="15840"/>
       <w:pgMar w:top="1080" w:right="1152" w:bottom="1080" w:left="1152" w:header="720" w:footer="720" w:gutter="0"/>

</xml_diff>